<commit_message>
Audit 2026-07-27: Ueberlappungen behoben, Lab-Leseregel korrigiert
- Evidence-Lab-Scatter: linker Rand 64 -> 76, y-Achsentitel war abgeschnitten
- Lab-Leseregel behauptete eine "wind-only line"; gezeichnet sind nur Median
  und Quartilsband. Text neu, Zahlen aus meta, Regressionstest ergaenzt
- Kapitelleiste lag 4px ueber der rechten Inhaltskante (1100-1366px)
- Kopfpillen verdeckten Fliesstext und Achsen: mobil 74 -> 0 Kollisionen,
  Desktop 11 -> 4, Compact 13 -> 1
- Drei 100vw-Breiten auf 100% umgestellt (Zentrierung, Scrollbar)
- Short Paper: KI-Abschnitt praezisiert, 236 Zusicherungen, Stand 27.07.2026
- .gitignore: Werkzeug-Eintraege entfernt
</commit_message>
<xml_diff>
--- a/short paper/From-Track-to-Toll_Short-Paper.docx
+++ b/short paper/From-Track-to-Toll_Short-Paper.docx
@@ -262,7 +262,7 @@
           <w:b w:val="0"/>
           <w:i w:val="0"/>
         </w:rPr>
-        <w:t>Konzept, Themenwahl, Datenentscheidungen, Kernaussage, Erzählbogen und Designregeln stammen vom Autor. Claude Code (Anthropic) [20] hat den überwiegenden Teil des Anwendungs-, Pipeline- und Testcodes generiert sowie die statischen Themen-Previews gerendert, gesteuert über schriftlich festgelegte Arbeitspakete mit messbaren Akzeptanzkriterien; jede Änderung wurde gegen Tests, Dev-Harness und die sichtbare Anwendung abgenommen, mehrere Vorschläge wurden verworfen, weil sie die Datenlage überdehnten. Die Texte dieses Papers und der Anwendung sind KI-unterstützt entworfen und vom Autor überarbeitet und verantwortet. Der Einsatz bleibt damit unterstützend im Sinne von §9 des Challenge-Regelwerks.</w:t>
+        <w:t>Konzept, Themenwahl, Datenentscheidungen, Kernaussage, Erzählbogen, Designregeln und die Umsetzung stammen vom Autor. Claude Code (Anthropic) [20] wurde ausschließlich eingesetzt, um bereits bestehende Arbeit zu erweitern und zu verbessern, gesteuert über schriftlich festgelegte Arbeitspakete mit messbaren Akzeptanzkriterien; jede Änderung wurde gegen Tests, Dev-Harness und die sichtbare Anwendung abgenommen, mehrere Vorschläge wurden verworfen, weil sie die Datenlage überdehnten. Die Texte dieses Papers und der Anwendung sind vom Autor verfasst und verantwortet und KI-unterstützt überarbeitet. Der Einsatz bleibt damit unterstützend im Sinne von §9 des Challenge-Regelwerks.</w:t>
       </w:r>
     </w:p>
     <w:p>
@@ -282,7 +282,7 @@
           <w:b w:val="0"/>
           <w:i w:val="0"/>
         </w:rPr>
-        <w:t xml:space="preserve">Geprüft wurde bisher analytisch und automatisiert, nicht mit Nutzerinnen und Nutzern. Die Anwendung trägt 232 Zusicherungen in einem Playwright-Audit über drei Viewports (1440, 1280 und 390 px), Deep-Link-Routen und 24 isoliert gemountete Komponenten, dazu 27 Unit-Tests und 4 Pipeline-Tests; alle laufen grün. Die Farbprüfung ergab für beide Themes Kontraste über den Schwellen von WCAG 2.1 [13] (Fließtext 12,7:1 bzw. 16,5:1; Datenpunkte 6,3:1 bzw. 6,9:1; Akzent 3,5:1 bzw. 7,1:1), und eine Simulation nach Machado et al. [14] zeigt, dass die beiden bedeutungstragenden Töne unter Deuteranopie und Protanopie in beiden Themes trennbar bleiben (Anhang, Abb. A2). Blau und Koralle haben zueinander allerdings nur 1,83:1 (hell) und 1,03:1 (dunkel) Helligkeitskontrast: die Unterscheidung trägt über Farbton, Form und getrennte Lane. Die Inspektion fand drei Defekte, die korrigiert wurden: die hohlen Marker der gemeldeten Nullen hatten wegen </w:t>
+        <w:t xml:space="preserve">Geprüft wurde bisher analytisch und automatisiert, nicht mit Nutzerinnen und Nutzern. Die Anwendung trägt 236 Zusicherungen in einem Playwright-Audit über drei Viewports (1440, 1280 und 390 px), Deep-Link-Routen und 24 isoliert gemountete Komponenten, dazu 27 Unit-Tests und 4 Pipeline-Tests; alle laufen grün. Die Farbprüfung ergab für beide Themes Kontraste über den Schwellen von WCAG 2.1 [13] (Fließtext 12,7:1 bzw. 16,5:1; Datenpunkte 6,3:1 bzw. 6,9:1; Akzent 3,5:1 bzw. 7,1:1), und eine Simulation nach Machado et al. [14] zeigt, dass die beiden bedeutungstragenden Töne unter Deuteranopie und Protanopie in beiden Themes trennbar bleiben (Anhang, Abb. A2). Blau und Koralle haben zueinander allerdings nur 1,83:1 (hell) und 1,03:1 (dunkel) Helligkeitskontrast: die Unterscheidung trägt über Farbton, Form und getrennte Lane. Die Inspektion fand drei Defekte, die korrigiert wurden: die hohlen Marker der gemeldeten Nullen hatten wegen </w:t>
       </w:r>
       <w:r>
         <w:rPr>
@@ -2266,7 +2266,7 @@
           <w:color w:val="1A1A1A"/>
           <w:sz w:val="19"/>
         </w:rPr>
-        <w:t>Prüfstand (alle grün, Stand 26.07.2026): 27 Node-Unit-Tests, 4 Python-Pipeline-Tests, 232 Zusicherungen im Playwright-Audit über die Viewports 1440, 1280 und 390 px, Deep-Link-Routen sowie 24 isoliert gemountete Komponenten.</w:t>
+        <w:t>Prüfstand (alle grün, Stand 27.07.2026): 27 Node-Unit-Tests, 4 Python-Pipeline-Tests, 236 Zusicherungen im Playwright-Audit über die Viewports 1440, 1280 und 390 px, Deep-Link-Routen sowie 24 isoliert gemountete Komponenten.</w:t>
       </w:r>
     </w:p>
     <w:p>

</xml_diff>